<commit_message>
feat: serve persisted transaction history
</commit_message>
<xml_diff>
--- a/docs/Dhokha_Backend_Engineering_Guide.docx
+++ b/docs/Dhokha_Backend_Engineering_Guide.docx
@@ -522,7 +522,7 @@
                 <w:color w:val="1F4D78"/>
                 <w:sz w:val="19"/>
               </w:rPr>
-              <w:t>https://bq8qc3ysd8.execute-api.ap-south-1.amazonaws.com</w:t>
+              <w:t>https://api.dhokha.bharathperni.dev</w:t>
             </w:r>
             <w:r>
               <w:rPr>
@@ -590,7 +590,7 @@
                 <w:color w:val="1F4D78"/>
                 <w:sz w:val="19"/>
               </w:rPr>
-              <w:t>https://bq8qc3ysd8.execute-api.ap-south-1.amazonaws.com/docs</w:t>
+              <w:t>https://api.dhokha.bharathperni.dev/docs</w:t>
             </w:r>
             <w:r>
               <w:rPr>
@@ -658,7 +658,75 @@
                 <w:color w:val="1F4D78"/>
                 <w:sz w:val="19"/>
               </w:rPr>
-              <w:t>https://bq8qc3ysd8.execute-api.ap-south-1.amazonaws.com/openapi.json</w:t>
+              <w:t>https://api.dhokha.bharathperni.dev/openapi.json</w:t>
+            </w:r>
+            <w:r>
+              <w:rPr>
+                <w:rFonts w:ascii="Calibri" w:hAnsi="Calibri"/>
+                <w:color w:val="000000"/>
+                <w:sz w:val="22"/>
+              </w:rPr>
+            </w:r>
+          </w:p>
+        </w:tc>
+      </w:tr>
+      <w:tr>
+        <w:tc>
+          <w:tcPr>
+            <w:tcW w:type="dxa" w:w="2700"/>
+            <w:tcMar>
+              <w:top w:w="80" w:type="dxa"/>
+              <w:start w:w="120" w:type="dxa"/>
+              <w:bottom w:w="80" w:type="dxa"/>
+              <w:end w:w="120" w:type="dxa"/>
+            </w:tcMar>
+            <w:vAlign w:val="center"/>
+          </w:tcPr>
+          <w:p>
+            <w:pPr>
+              <w:spacing w:after="40"/>
+            </w:pPr>
+            <w:r/>
+            <w:r>
+              <w:rPr>
+                <w:rFonts w:ascii="Calibri" w:hAnsi="Calibri"/>
+                <w:color w:val="000000"/>
+                <w:sz w:val="22"/>
+              </w:rPr>
+              <w:t>WebSocket stream</w:t>
+            </w:r>
+          </w:p>
+        </w:tc>
+        <w:tc>
+          <w:tcPr>
+            <w:tcW w:type="dxa" w:w="6660"/>
+            <w:tcMar>
+              <w:top w:w="80" w:type="dxa"/>
+              <w:start w:w="120" w:type="dxa"/>
+              <w:bottom w:w="80" w:type="dxa"/>
+              <w:end w:w="120" w:type="dxa"/>
+            </w:tcMar>
+            <w:vAlign w:val="center"/>
+          </w:tcPr>
+          <w:p>
+            <w:pPr>
+              <w:spacing w:after="40"/>
+            </w:pPr>
+            <w:r/>
+            <w:r>
+              <w:rPr>
+                <w:rFonts w:ascii="Calibri" w:hAnsi="Calibri"/>
+                <w:color w:val="000000"/>
+                <w:sz w:val="22"/>
+              </w:rPr>
+            </w:r>
+            <w:r>
+              <w:rPr>
+                <w:rFonts w:ascii="Consolas" w:hAnsi="Consolas"/>
+                <w:color w:val="1F4D78"/>
+                <w:sz w:val="19"/>
+              </w:rPr>
+              <w:t>wss://api.dhokha.bharathperni.dev/stream</w:t>
             </w:r>
             <w:r>
               <w:rPr>
@@ -1723,7 +1791,7 @@
                 <w:color w:val="000000"/>
                 <w:sz w:val="22"/>
               </w:rPr>
-              <w:t>API Gateway</w:t>
+              <w:t>Let's Encrypt</w:t>
             </w:r>
           </w:p>
         </w:tc>
@@ -1749,7 +1817,7 @@
                 <w:color w:val="000000"/>
                 <w:sz w:val="22"/>
               </w:rPr>
-              <w:t>HTTPS proxy</w:t>
+              <w:t>TLS certificate</w:t>
             </w:r>
           </w:p>
         </w:tc>
@@ -1775,7 +1843,7 @@
                 <w:color w:val="000000"/>
                 <w:sz w:val="22"/>
               </w:rPr>
-              <w:t>Allows an HTTPS frontend to call the EC2 backend without mixed-content failures.</w:t>
+              <w:t>Gives REST and WebSocket traffic a browser-trusted certificate with automatic renewal.</w:t>
             </w:r>
           </w:p>
         </w:tc>
@@ -1841,7 +1909,7 @@
           <w:color w:val="FFFFFF"/>
           <w:sz w:val="16"/>
         </w:rPr>
-        <w:t xml:space="preserve">    | HTTPS /api/*</w:t>
+        <w:t xml:space="preserve">    | HTTPS /api/* and WSS /stream</w:t>
       </w:r>
     </w:p>
     <w:p>
@@ -1916,52 +1984,7 @@
           <w:color w:val="FFFFFF"/>
           <w:sz w:val="16"/>
         </w:rPr>
-        <w:t>AWS API Gateway (HTTPS)</w:t>
-      </w:r>
-    </w:p>
-    <w:p>
-      <w:pPr>
-        <w:spacing w:before="0" w:after="0" w:line="240" w:lineRule="auto"/>
-        <w:ind w:left="115" w:right="115"/>
-        <w:shd w:fill="161B22"/>
-      </w:pPr>
-      <w:r>
-        <w:rPr>
-          <w:rFonts w:ascii="Consolas" w:hAnsi="Consolas"/>
-          <w:color w:val="FFFFFF"/>
-          <w:sz w:val="16"/>
-        </w:rPr>
-        <w:t xml:space="preserve">    |</w:t>
-      </w:r>
-    </w:p>
-    <w:p>
-      <w:pPr>
-        <w:spacing w:before="0" w:after="0" w:line="240" w:lineRule="auto"/>
-        <w:ind w:left="115" w:right="115"/>
-        <w:shd w:fill="161B22"/>
-      </w:pPr>
-      <w:r>
-        <w:rPr>
-          <w:rFonts w:ascii="Consolas" w:hAnsi="Consolas"/>
-          <w:color w:val="FFFFFF"/>
-          <w:sz w:val="16"/>
-        </w:rPr>
-        <w:t xml:space="preserve">    v</w:t>
-      </w:r>
-    </w:p>
-    <w:p>
-      <w:pPr>
-        <w:spacing w:before="0" w:after="0" w:line="240" w:lineRule="auto"/>
-        <w:ind w:left="115" w:right="115"/>
-        <w:shd w:fill="161B22"/>
-      </w:pPr>
-      <w:r>
-        <w:rPr>
-          <w:rFonts w:ascii="Consolas" w:hAnsi="Consolas"/>
-          <w:color w:val="FFFFFF"/>
-          <w:sz w:val="16"/>
-        </w:rPr>
-        <w:t>Nginx on EC2 :80</w:t>
+        <w:t>Nginx on EC2 :443</w:t>
       </w:r>
     </w:p>
     <w:p>
@@ -5780,7 +5803,7 @@
           <w:color w:val="1F4D78"/>
           <w:sz w:val="19"/>
         </w:rPr>
-        <w:t>POST /demo/reset</w:t>
+        <w:t>GET /transactions</w:t>
       </w:r>
       <w:r>
         <w:rPr>
@@ -5797,7 +5820,231 @@
           <w:color w:val="000000"/>
           <w:sz w:val="22"/>
         </w:rPr>
-        <w:t>Destructive demo-only operation. Clears transactions, alerts, accounts, devices, and cache values, then recreates 40 deterministic accounts across four banks.</w:t>
+        <w:t>Returns scored transactions persisted in SQLite, newest first. The dashboard</w:t>
+      </w:r>
+    </w:p>
+    <w:p>
+      <w:r>
+        <w:rPr>
+          <w:rFonts w:ascii="Calibri" w:hAnsi="Calibri"/>
+          <w:color w:val="000000"/>
+          <w:sz w:val="22"/>
+        </w:rPr>
+        <w:t>uses this endpoint as its historical data source.</w:t>
+      </w:r>
+    </w:p>
+    <w:p>
+      <w:r>
+        <w:rPr>
+          <w:rFonts w:ascii="Calibri" w:hAnsi="Calibri"/>
+          <w:color w:val="000000"/>
+          <w:sz w:val="22"/>
+        </w:rPr>
+        <w:t xml:space="preserve">Query parameters are optional </w:t>
+      </w:r>
+      <w:r>
+        <w:rPr>
+          <w:rFonts w:ascii="Consolas" w:hAnsi="Consolas"/>
+          <w:color w:val="1F4D78"/>
+          <w:sz w:val="19"/>
+        </w:rPr>
+        <w:t>decision</w:t>
+      </w:r>
+      <w:r>
+        <w:rPr>
+          <w:rFonts w:ascii="Calibri" w:hAnsi="Calibri"/>
+          <w:color w:val="000000"/>
+          <w:sz w:val="22"/>
+        </w:rPr>
+        <w:t xml:space="preserve"> (</w:t>
+      </w:r>
+      <w:r>
+        <w:rPr>
+          <w:rFonts w:ascii="Consolas" w:hAnsi="Consolas"/>
+          <w:color w:val="1F4D78"/>
+          <w:sz w:val="19"/>
+        </w:rPr>
+        <w:t>allow</w:t>
+      </w:r>
+      <w:r>
+        <w:rPr>
+          <w:rFonts w:ascii="Calibri" w:hAnsi="Calibri"/>
+          <w:color w:val="000000"/>
+          <w:sz w:val="22"/>
+        </w:rPr>
+        <w:t xml:space="preserve">, </w:t>
+      </w:r>
+      <w:r>
+        <w:rPr>
+          <w:rFonts w:ascii="Consolas" w:hAnsi="Consolas"/>
+          <w:color w:val="1F4D78"/>
+          <w:sz w:val="19"/>
+        </w:rPr>
+        <w:t>review</w:t>
+      </w:r>
+      <w:r>
+        <w:rPr>
+          <w:rFonts w:ascii="Calibri" w:hAnsi="Calibri"/>
+          <w:color w:val="000000"/>
+          <w:sz w:val="22"/>
+        </w:rPr>
+        <w:t xml:space="preserve">, or </w:t>
+      </w:r>
+      <w:r>
+        <w:rPr>
+          <w:rFonts w:ascii="Consolas" w:hAnsi="Consolas"/>
+          <w:color w:val="1F4D78"/>
+          <w:sz w:val="19"/>
+        </w:rPr>
+        <w:t>block</w:t>
+      </w:r>
+      <w:r>
+        <w:rPr>
+          <w:rFonts w:ascii="Calibri" w:hAnsi="Calibri"/>
+          <w:color w:val="000000"/>
+          <w:sz w:val="22"/>
+        </w:rPr>
+        <w:t>),</w:t>
+      </w:r>
+    </w:p>
+    <w:p>
+      <w:r>
+        <w:rPr>
+          <w:rFonts w:ascii="Calibri" w:hAnsi="Calibri"/>
+          <w:color w:val="000000"/>
+          <w:sz w:val="22"/>
+        </w:rPr>
+      </w:r>
+      <w:r>
+        <w:rPr>
+          <w:rFonts w:ascii="Consolas" w:hAnsi="Consolas"/>
+          <w:color w:val="1F4D78"/>
+          <w:sz w:val="19"/>
+        </w:rPr>
+        <w:t>limit</w:t>
+      </w:r>
+      <w:r>
+        <w:rPr>
+          <w:rFonts w:ascii="Calibri" w:hAnsi="Calibri"/>
+          <w:color w:val="000000"/>
+          <w:sz w:val="22"/>
+        </w:rPr>
+        <w:t xml:space="preserve"> (</w:t>
+      </w:r>
+      <w:r>
+        <w:rPr>
+          <w:rFonts w:ascii="Consolas" w:hAnsi="Consolas"/>
+          <w:color w:val="1F4D78"/>
+          <w:sz w:val="19"/>
+        </w:rPr>
+        <w:t>1</w:t>
+      </w:r>
+      <w:r>
+        <w:rPr>
+          <w:rFonts w:ascii="Calibri" w:hAnsi="Calibri"/>
+          <w:color w:val="000000"/>
+          <w:sz w:val="22"/>
+        </w:rPr>
+        <w:t>–</w:t>
+      </w:r>
+      <w:r>
+        <w:rPr>
+          <w:rFonts w:ascii="Consolas" w:hAnsi="Consolas"/>
+          <w:color w:val="1F4D78"/>
+          <w:sz w:val="19"/>
+        </w:rPr>
+        <w:t>500</w:t>
+      </w:r>
+      <w:r>
+        <w:rPr>
+          <w:rFonts w:ascii="Calibri" w:hAnsi="Calibri"/>
+          <w:color w:val="000000"/>
+          <w:sz w:val="22"/>
+        </w:rPr>
+        <w:t xml:space="preserve">), and zero-based </w:t>
+      </w:r>
+      <w:r>
+        <w:rPr>
+          <w:rFonts w:ascii="Consolas" w:hAnsi="Consolas"/>
+          <w:color w:val="1F4D78"/>
+          <w:sz w:val="19"/>
+        </w:rPr>
+        <w:t>offset</w:t>
+      </w:r>
+      <w:r>
+        <w:rPr>
+          <w:rFonts w:ascii="Calibri" w:hAnsi="Calibri"/>
+          <w:color w:val="000000"/>
+          <w:sz w:val="22"/>
+        </w:rPr>
+        <w:t>. Items include account and bank</w:t>
+      </w:r>
+    </w:p>
+    <w:p>
+      <w:r>
+        <w:rPr>
+          <w:rFonts w:ascii="Calibri" w:hAnsi="Calibri"/>
+          <w:color w:val="000000"/>
+          <w:sz w:val="22"/>
+        </w:rPr>
+        <w:t>IDs, amount, timestamp, scores, decision, rules, reasons, and latency.</w:t>
+      </w:r>
+    </w:p>
+    <w:p>
+      <w:pPr>
+        <w:pStyle w:val="Heading2"/>
+      </w:pPr>
+      <w:r>
+        <w:rPr>
+          <w:rFonts w:ascii="Calibri" w:hAnsi="Calibri"/>
+          <w:color w:val="000000"/>
+          <w:sz w:val="22"/>
+        </w:rPr>
+      </w:r>
+      <w:r>
+        <w:rPr>
+          <w:rFonts w:ascii="Consolas" w:hAnsi="Consolas"/>
+          <w:color w:val="1F4D78"/>
+          <w:sz w:val="19"/>
+        </w:rPr>
+        <w:t>POST /demo/reset</w:t>
+      </w:r>
+      <w:r>
+        <w:rPr>
+          <w:rFonts w:ascii="Calibri" w:hAnsi="Calibri"/>
+          <w:color w:val="000000"/>
+          <w:sz w:val="22"/>
+        </w:rPr>
+      </w:r>
+    </w:p>
+    <w:p>
+      <w:r>
+        <w:rPr>
+          <w:rFonts w:ascii="Calibri" w:hAnsi="Calibri"/>
+          <w:color w:val="000000"/>
+          <w:sz w:val="22"/>
+        </w:rPr>
+        <w:t>Destructive demo-only operation. Clears transactions, alerts, accounts,</w:t>
+      </w:r>
+    </w:p>
+    <w:p>
+      <w:r>
+        <w:rPr>
+          <w:rFonts w:ascii="Calibri" w:hAnsi="Calibri"/>
+          <w:color w:val="000000"/>
+          <w:sz w:val="22"/>
+        </w:rPr>
+        <w:t>devices, and cache values, then recreates 40 deterministic accounts and 12</w:t>
+      </w:r>
+    </w:p>
+    <w:p>
+      <w:r>
+        <w:rPr>
+          <w:rFonts w:ascii="Calibri" w:hAnsi="Calibri"/>
+          <w:color w:val="000000"/>
+          <w:sz w:val="22"/>
+        </w:rPr>
+        <w:t>persisted background transactions across four banks.</w:t>
       </w:r>
     </w:p>
     <w:p>
@@ -6731,38 +6978,17 @@
           <w:color w:val="000000"/>
           <w:sz w:val="22"/>
         </w:rPr>
-        <w:t xml:space="preserve">Local URL: </w:t>
-      </w:r>
-      <w:r>
-        <w:rPr>
-          <w:rFonts w:ascii="Consolas" w:hAnsi="Consolas"/>
-          <w:color w:val="1F4D78"/>
-          <w:sz w:val="19"/>
-        </w:rPr>
-        <w:t>ws://127.0.0.1:8000/stream</w:t>
-      </w:r>
+        <w:t>Transaction events include account/bank IDs, amount, timestamp, scores,</w:t>
+      </w:r>
+    </w:p>
+    <w:p>
       <w:r>
         <w:rPr>
           <w:rFonts w:ascii="Calibri" w:hAnsi="Calibri"/>
           <w:color w:val="000000"/>
           <w:sz w:val="22"/>
         </w:rPr>
-        <w:t>.</w:t>
-      </w:r>
-    </w:p>
-    <w:p>
-      <w:r>
-        <w:rPr>
-          <w:rFonts w:ascii="Calibri" w:hAnsi="Calibri"/>
-          <w:color w:val="000000"/>
-          <w:sz w:val="22"/>
-        </w:rPr>
-        <w:t>The EC2/Nginx origin supports WebSocket upgrade. The existing HTTP API Gateway proxy is intended for HTTP endpoints; a production HTTPS dashboard should use a dedicated WebSocket API or another WebSocket-capable edge.</w:t>
-      </w:r>
-    </w:p>
-    <w:p>
-      <w:r>
-        <w:br w:type="page"/>
+        <w:t>decision, and suspected swarm types.</w:t>
       </w:r>
     </w:p>
     <w:p>
@@ -8657,7 +8883,7 @@
           <w:color w:val="1F4D78"/>
           <w:sz w:val="19"/>
         </w:rPr>
-        <w:t>15 passed</w:t>
+        <w:t>16 passed</w:t>
       </w:r>
       <w:r>
         <w:rPr>
@@ -8863,7 +9089,7 @@
           <w:color w:val="000000"/>
           <w:sz w:val="22"/>
         </w:rPr>
-        <w:t>Nginx on port 80;</w:t>
+        <w:t>Nginx on ports 80 and 443;</w:t>
       </w:r>
     </w:p>
     <w:p>
@@ -8905,20 +9131,23 @@
           <w:color w:val="000000"/>
           <w:sz w:val="22"/>
         </w:rPr>
-        <w:t>API Gateway for public HTTPS;</w:t>
-      </w:r>
-    </w:p>
-    <w:p>
-      <w:pPr>
-        <w:pStyle w:val="ListBullet"/>
-      </w:pPr>
+        <w:t xml:space="preserve">Name.com DNS for </w:t>
+      </w:r>
+      <w:r>
+        <w:rPr>
+          <w:rFonts w:ascii="Consolas" w:hAnsi="Consolas"/>
+          <w:color w:val="1F4D78"/>
+          <w:sz w:val="19"/>
+        </w:rPr>
+        <w:t>api.dhokha.bharathperni.dev</w:t>
+      </w:r>
       <w:r>
         <w:rPr>
           <w:rFonts w:ascii="Calibri" w:hAnsi="Calibri"/>
           <w:color w:val="000000"/>
           <w:sz w:val="22"/>
         </w:rPr>
-        <w:t>Systems Manager for backend updates;</w:t>
+        <w:t>;</w:t>
       </w:r>
     </w:p>
     <w:p>
@@ -8931,16 +9160,42 @@
           <w:color w:val="000000"/>
           <w:sz w:val="22"/>
         </w:rPr>
-        <w:t>SSM Parameter Store for the Bedrock key.</w:t>
+        <w:t>a Let's Encrypt certificate with automatic renewal;</w:t>
       </w:r>
     </w:p>
     <w:p>
+      <w:pPr>
+        <w:pStyle w:val="ListBullet"/>
+      </w:pPr>
       <w:r>
         <w:rPr>
           <w:rFonts w:ascii="Calibri" w:hAnsi="Calibri"/>
           <w:color w:val="000000"/>
           <w:sz w:val="22"/>
         </w:rPr>
+        <w:t>Systems Manager for backend updates;</w:t>
+      </w:r>
+    </w:p>
+    <w:p>
+      <w:pPr>
+        <w:pStyle w:val="ListBullet"/>
+      </w:pPr>
+      <w:r>
+        <w:rPr>
+          <w:rFonts w:ascii="Calibri" w:hAnsi="Calibri"/>
+          <w:color w:val="000000"/>
+          <w:sz w:val="22"/>
+        </w:rPr>
+        <w:t>SSM Parameter Store for the Bedrock key.</w:t>
+      </w:r>
+    </w:p>
+    <w:p>
+      <w:r>
+        <w:rPr>
+          <w:rFonts w:ascii="Calibri" w:hAnsi="Calibri"/>
+          <w:color w:val="000000"/>
+          <w:sz w:val="22"/>
+        </w:rPr>
         <w:t xml:space="preserve">Deployment scripts are under </w:t>
       </w:r>
       <w:r>
@@ -8957,7 +9212,7 @@
           <w:color w:val="000000"/>
           <w:sz w:val="22"/>
         </w:rPr>
-        <w:t xml:space="preserve">. Use </w:t>
+        <w:t xml:space="preserve">. After the Name.com </w:t>
       </w:r>
       <w:r>
         <w:rPr>
@@ -8965,7 +9220,7 @@
           <w:color w:val="1F4D78"/>
           <w:sz w:val="19"/>
         </w:rPr>
-        <w:t>destroy-ec2.sh</w:t>
+        <w:t>A</w:t>
       </w:r>
       <w:r>
         <w:rPr>
@@ -8973,41 +9228,56 @@
           <w:color w:val="000000"/>
           <w:sz w:val="22"/>
         </w:rPr>
-        <w:t xml:space="preserve"> after the demo to remove API Gateway, EC2, S3 artifacts, the security group, SSM parameter, and deployment IAM resources.</w:t>
+        <w:t xml:space="preserve"> record points to the EC2 public IP, run:</w:t>
       </w:r>
     </w:p>
     <w:p>
       <w:pPr>
-        <w:pStyle w:val="Heading1"/>
-      </w:pPr>
-      <w:r>
-        <w:t>14. Security and Privacy</w:t>
+        <w:spacing w:before="40" w:after="40" w:line="240" w:lineRule="auto"/>
+        <w:ind w:left="115" w:right="115"/>
+        <w:shd w:fill="161B22"/>
+      </w:pPr>
+      <w:r>
+        <w:rPr>
+          <w:rFonts w:ascii="Consolas" w:hAnsi="Consolas"/>
+          <w:color w:val="FFFFFF"/>
+          <w:sz w:val="16"/>
+        </w:rPr>
+        <w:t>./deploy/aws/configure-domain-tls.sh api.dhokha.bharathperni.dev</w:t>
       </w:r>
     </w:p>
     <w:p>
-      <w:pPr>
-        <w:pStyle w:val="ListBullet"/>
-      </w:pPr>
       <w:r>
         <w:rPr>
           <w:rFonts w:ascii="Calibri" w:hAnsi="Calibri"/>
           <w:color w:val="000000"/>
           <w:sz w:val="22"/>
         </w:rPr>
-        <w:t>Synthetic data only.</w:t>
-      </w:r>
-    </w:p>
-    <w:p>
-      <w:pPr>
-        <w:pStyle w:val="ListBullet"/>
-      </w:pPr>
+        <w:t xml:space="preserve">Use </w:t>
+      </w:r>
+      <w:r>
+        <w:rPr>
+          <w:rFonts w:ascii="Consolas" w:hAnsi="Consolas"/>
+          <w:color w:val="1F4D78"/>
+          <w:sz w:val="19"/>
+        </w:rPr>
+        <w:t>destroy-ec2.sh</w:t>
+      </w:r>
       <w:r>
         <w:rPr>
           <w:rFonts w:ascii="Calibri" w:hAnsi="Calibri"/>
           <w:color w:val="000000"/>
           <w:sz w:val="22"/>
         </w:rPr>
-        <w:t>PAN/Aadhaar-like values are hashed.</w:t>
+        <w:t xml:space="preserve"> after the demo to remove API Gateway, EC2, S3 artifacts, the security group, SSM parameter, and deployment IAM resources. DNS records at Name.com must be removed separately.</w:t>
+      </w:r>
+    </w:p>
+    <w:p>
+      <w:pPr>
+        <w:pStyle w:val="Heading1"/>
+      </w:pPr>
+      <w:r>
+        <w:t>14. Security and Privacy</w:t>
       </w:r>
     </w:p>
     <w:p>
@@ -9020,7 +9290,7 @@
           <w:color w:val="000000"/>
           <w:sz w:val="22"/>
         </w:rPr>
-        <w:t>No authentication or authorization in the MVP.</w:t>
+        <w:t>Synthetic data only.</w:t>
       </w:r>
     </w:p>
     <w:p>
@@ -9033,7 +9303,7 @@
           <w:color w:val="000000"/>
           <w:sz w:val="22"/>
         </w:rPr>
-        <w:t>Demo reset and injection endpoints must not be exposed in production.</w:t>
+        <w:t>PAN/Aadhaar-like values are hashed.</w:t>
       </w:r>
     </w:p>
     <w:p>
@@ -9046,7 +9316,7 @@
           <w:color w:val="000000"/>
           <w:sz w:val="22"/>
         </w:rPr>
-        <w:t>Deployed CORS is broad for presentation convenience.</w:t>
+        <w:t>No authentication or authorization in the MVP.</w:t>
       </w:r>
     </w:p>
     <w:p>
@@ -9059,7 +9329,7 @@
           <w:color w:val="000000"/>
           <w:sz w:val="22"/>
         </w:rPr>
-        <w:t>SQLite is not suitable for multiple concurrent replicas.</w:t>
+        <w:t>Demo reset and injection endpoints must not be exposed in production.</w:t>
       </w:r>
     </w:p>
     <w:p>
@@ -9072,7 +9342,7 @@
           <w:color w:val="000000"/>
           <w:sz w:val="22"/>
         </w:rPr>
-        <w:t>Bedrock credentials remain server-side.</w:t>
+        <w:t>Deployed CORS is broad for presentation convenience.</w:t>
       </w:r>
     </w:p>
     <w:p>
@@ -9085,15 +9355,7 @@
           <w:color w:val="000000"/>
           <w:sz w:val="22"/>
         </w:rPr>
-        <w:t>Logs and screenshots must not include API keys.</w:t>
-      </w:r>
-    </w:p>
-    <w:p>
-      <w:pPr>
-        <w:pStyle w:val="Heading1"/>
-      </w:pPr>
-      <w:r>
-        <w:t>15. Current Limitations</w:t>
+        <w:t>SQLite is not suitable for multiple concurrent replicas.</w:t>
       </w:r>
     </w:p>
     <w:p>
@@ -9106,7 +9368,41 @@
           <w:color w:val="000000"/>
           <w:sz w:val="22"/>
         </w:rPr>
-        <w:t xml:space="preserve">Dashboard, graph explorer, alerts, and swarm controls still contain mock-data paths; only the Transaction Scorer is fully connected to </w:t>
+        <w:t>Bedrock credentials remain server-side.</w:t>
+      </w:r>
+    </w:p>
+    <w:p>
+      <w:pPr>
+        <w:pStyle w:val="ListBullet"/>
+      </w:pPr>
+      <w:r>
+        <w:rPr>
+          <w:rFonts w:ascii="Calibri" w:hAnsi="Calibri"/>
+          <w:color w:val="000000"/>
+          <w:sz w:val="22"/>
+        </w:rPr>
+        <w:t>Logs and screenshots must not include API keys.</w:t>
+      </w:r>
+    </w:p>
+    <w:p>
+      <w:pPr>
+        <w:pStyle w:val="Heading1"/>
+      </w:pPr>
+      <w:r>
+        <w:t>15. Current Limitations</w:t>
+      </w:r>
+    </w:p>
+    <w:p>
+      <w:pPr>
+        <w:pStyle w:val="ListBullet"/>
+      </w:pPr>
+      <w:r>
+        <w:rPr>
+          <w:rFonts w:ascii="Calibri" w:hAnsi="Calibri"/>
+          <w:color w:val="000000"/>
+          <w:sz w:val="22"/>
+        </w:rPr>
+        <w:t xml:space="preserve">Transaction Scorer is connected to </w:t>
       </w:r>
       <w:r>
         <w:rPr>
@@ -9122,7 +9418,7 @@
           <w:color w:val="000000"/>
           <w:sz w:val="22"/>
         </w:rPr>
-        <w:t xml:space="preserve"> and </w:t>
+        <w:t xml:space="preserve">, </w:t>
       </w:r>
       <w:r>
         <w:rPr>
@@ -9138,19 +9434,23 @@
           <w:color w:val="000000"/>
           <w:sz w:val="22"/>
         </w:rPr>
-        <w:t>.</w:t>
-      </w:r>
-    </w:p>
-    <w:p>
-      <w:pPr>
-        <w:pStyle w:val="ListBullet"/>
-      </w:pPr>
+        <w:t xml:space="preserve">, </w:t>
+      </w:r>
+      <w:r>
+        <w:rPr>
+          <w:rFonts w:ascii="Consolas" w:hAnsi="Consolas"/>
+          <w:color w:val="1F4D78"/>
+          <w:sz w:val="19"/>
+        </w:rPr>
+        <w:t>/score</w:t>
+      </w:r>
       <w:r>
         <w:rPr>
           <w:rFonts w:ascii="Calibri" w:hAnsi="Calibri"/>
           <w:color w:val="000000"/>
           <w:sz w:val="22"/>
         </w:rPr>
+        <w:t xml:space="preserve">, and </w:t>
       </w:r>
       <w:r>
         <w:rPr>
@@ -9158,7 +9458,7 @@
           <w:color w:val="1F4D78"/>
           <w:sz w:val="19"/>
         </w:rPr>
-        <w:t>/score</w:t>
+        <w:t>/stream</w:t>
       </w:r>
       <w:r>
         <w:rPr>
@@ -9166,7 +9466,7 @@
           <w:color w:val="000000"/>
           <w:sz w:val="22"/>
         </w:rPr>
-        <w:t xml:space="preserve"> and </w:t>
+        <w:t xml:space="preserve">. Graph Explorer is connected to demo reset/injection, alerts, graph neighborhoods, and live swarm events. The dashboard transaction feed uses persisted </w:t>
       </w:r>
       <w:r>
         <w:rPr>
@@ -9174,7 +9474,7 @@
           <w:color w:val="1F4D78"/>
           <w:sz w:val="19"/>
         </w:rPr>
-        <w:t>/v1/evaluate</w:t>
+        <w:t>/transactions</w:t>
       </w:r>
       <w:r>
         <w:rPr>
@@ -9182,19 +9482,35 @@
           <w:color w:val="000000"/>
           <w:sz w:val="22"/>
         </w:rPr>
-        <w:t xml:space="preserve"> use separate feature/model pipelines.</w:t>
-      </w:r>
-    </w:p>
-    <w:p>
-      <w:pPr>
-        <w:pStyle w:val="ListBullet"/>
-      </w:pPr>
+        <w:t xml:space="preserve"> history plus live </w:t>
+      </w:r>
+      <w:r>
+        <w:rPr>
+          <w:rFonts w:ascii="Consolas" w:hAnsi="Consolas"/>
+          <w:color w:val="1F4D78"/>
+          <w:sz w:val="19"/>
+        </w:rPr>
+        <w:t>/stream</w:t>
+      </w:r>
       <w:r>
         <w:rPr>
           <w:rFonts w:ascii="Calibri" w:hAnsi="Calibri"/>
           <w:color w:val="000000"/>
           <w:sz w:val="22"/>
         </w:rPr>
+        <w:t xml:space="preserve"> updates. Case-file presentation data remains curated.</w:t>
+      </w:r>
+    </w:p>
+    <w:p>
+      <w:pPr>
+        <w:pStyle w:val="ListBullet"/>
+      </w:pPr>
+      <w:r>
+        <w:rPr>
+          <w:rFonts w:ascii="Calibri" w:hAnsi="Calibri"/>
+          <w:color w:val="000000"/>
+          <w:sz w:val="22"/>
+        </w:rPr>
       </w:r>
       <w:r>
         <w:rPr>
@@ -9202,7 +9518,7 @@
           <w:color w:val="1F4D78"/>
           <w:sz w:val="19"/>
         </w:rPr>
-        <w:t>geo_jump</w:t>
+        <w:t>/score</w:t>
       </w:r>
       <w:r>
         <w:rPr>
@@ -9210,20 +9526,23 @@
           <w:color w:val="000000"/>
           <w:sz w:val="22"/>
         </w:rPr>
-        <w:t xml:space="preserve"> is currently fixed to zero.</w:t>
-      </w:r>
-    </w:p>
-    <w:p>
-      <w:pPr>
-        <w:pStyle w:val="ListBullet"/>
-      </w:pPr>
+        <w:t xml:space="preserve"> and </w:t>
+      </w:r>
+      <w:r>
+        <w:rPr>
+          <w:rFonts w:ascii="Consolas" w:hAnsi="Consolas"/>
+          <w:color w:val="1F4D78"/>
+          <w:sz w:val="19"/>
+        </w:rPr>
+        <w:t>/v1/evaluate</w:t>
+      </w:r>
       <w:r>
         <w:rPr>
           <w:rFonts w:ascii="Calibri" w:hAnsi="Calibri"/>
           <w:color w:val="000000"/>
           <w:sz w:val="22"/>
         </w:rPr>
-        <w:t>No authentication, rate limiting, audit identity, or bank authorization.</w:t>
+        <w:t xml:space="preserve"> use separate feature/model pipelines.</w:t>
       </w:r>
     </w:p>
     <w:p>
@@ -9236,20 +9555,22 @@
           <w:color w:val="000000"/>
           <w:sz w:val="22"/>
         </w:rPr>
-        <w:t>No production-grade message queue or distributed background worker.</w:t>
-      </w:r>
-    </w:p>
-    <w:p>
-      <w:pPr>
-        <w:pStyle w:val="ListBullet"/>
-      </w:pPr>
+      </w:r>
+      <w:r>
+        <w:rPr>
+          <w:rFonts w:ascii="Consolas" w:hAnsi="Consolas"/>
+          <w:color w:val="1F4D78"/>
+          <w:sz w:val="19"/>
+        </w:rPr>
+        <w:t>geo_jump</w:t>
+      </w:r>
       <w:r>
         <w:rPr>
           <w:rFonts w:ascii="Calibri" w:hAnsi="Calibri"/>
           <w:color w:val="000000"/>
           <w:sz w:val="22"/>
         </w:rPr>
-        <w:t>Graph state is in one process and must be rebuilt from SQLite after restart.</w:t>
+        <w:t xml:space="preserve"> is currently fixed to zero.</w:t>
       </w:r>
     </w:p>
     <w:p>
@@ -9262,7 +9583,62 @@
           <w:color w:val="000000"/>
           <w:sz w:val="22"/>
         </w:rPr>
-        <w:t>The API Gateway HTTP proxy is not the production WebSocket solution.</w:t>
+        <w:t>No authentication, rate limiting, audit identity, or bank authorization.</w:t>
+      </w:r>
+    </w:p>
+    <w:p>
+      <w:pPr>
+        <w:pStyle w:val="ListBullet"/>
+      </w:pPr>
+      <w:r>
+        <w:rPr>
+          <w:rFonts w:ascii="Calibri" w:hAnsi="Calibri"/>
+          <w:color w:val="000000"/>
+          <w:sz w:val="22"/>
+        </w:rPr>
+        <w:t>No production-grade message queue or distributed background worker.</w:t>
+      </w:r>
+    </w:p>
+    <w:p>
+      <w:pPr>
+        <w:pStyle w:val="ListBullet"/>
+      </w:pPr>
+      <w:r>
+        <w:rPr>
+          <w:rFonts w:ascii="Calibri" w:hAnsi="Calibri"/>
+          <w:color w:val="000000"/>
+          <w:sz w:val="22"/>
+        </w:rPr>
+        <w:t>Graph state is in one process and must be rebuilt from SQLite after restart.</w:t>
+      </w:r>
+    </w:p>
+    <w:p>
+      <w:pPr>
+        <w:pStyle w:val="ListBullet"/>
+      </w:pPr>
+      <w:r>
+        <w:rPr>
+          <w:rFonts w:ascii="Calibri" w:hAnsi="Calibri"/>
+          <w:color w:val="000000"/>
+          <w:sz w:val="22"/>
+        </w:rPr>
+        <w:t xml:space="preserve">The custom DNS </w:t>
+      </w:r>
+      <w:r>
+        <w:rPr>
+          <w:rFonts w:ascii="Consolas" w:hAnsi="Consolas"/>
+          <w:color w:val="1F4D78"/>
+          <w:sz w:val="19"/>
+        </w:rPr>
+        <w:t>A</w:t>
+      </w:r>
+      <w:r>
+        <w:rPr>
+          <w:rFonts w:ascii="Calibri" w:hAnsi="Calibri"/>
+          <w:color w:val="000000"/>
+          <w:sz w:val="22"/>
+        </w:rPr>
+        <w:t xml:space="preserve"> record currently points to the instance public IP; stopping and starting the instance can change that IP unless an Elastic IP is attached.</w:t>
       </w:r>
     </w:p>
     <w:p>
@@ -9418,7 +9794,7 @@
           <w:color w:val="000000"/>
           <w:sz w:val="22"/>
         </w:rPr>
-        <w:t>Add a dedicated WebSocket/event service.</w:t>
+        <w:t>Move WebSocket fan-out to a durable event service when horizontally scaling.</w:t>
       </w:r>
     </w:p>
     <w:p>
@@ -9435,7 +9811,7 @@
           <w:color w:val="000000"/>
           <w:sz w:val="22"/>
         </w:rPr>
-        <w:t>Connect all dashboard surfaces to the live APIs.</w:t>
+        <w:t>Replace the remaining curated case-file presentation data with investigation APIs.</w:t>
       </w:r>
     </w:p>
     <w:p>

</xml_diff>